<commit_message>
feat(drone): insert orthomosaic figures into standalone Word report
- 4 AoI orthomosaic PNGs (Aborlove, Agatsivi-Agortoe, Salo-Agortoe,
  Anyanui Combine) inserted into Table 4 placeholder with figure captions
  and ECW master file sizes noted
- Placeholder register row 1 marked FILLED (green)
- Remaining placeholders (mission coverage map, condition panels, species
  discrimination, EOSDA screenshots) remain pending

Co-Authored-By: Claude Sonnet 4.6 <noreply@anthropic.com>
</commit_message>
<xml_diff>
--- a/STANDALONE_Drone_Survey_EOSDA_Report.docx
+++ b/STANDALONE_Drone_Survey_EOSDA_Report.docx
@@ -3609,59 +3609,226 @@
             </w:tcMar>
           </w:tcPr>
           <w:p>
-            <w:r>
-              <w:rPr>
-                <w:b/>
-                <w:bCs/>
-                <w:color w:val="A06000"/>
+            <w:pPr>
+              <w:jc w:val="center"/>
+            </w:pPr>
+            <w:r>
+              <w:drawing>
+                <wp:inline xmlns:a="http://schemas.openxmlformats.org/drawingml/2006/main" xmlns:pic="http://schemas.openxmlformats.org/drawingml/2006/picture">
+                  <wp:extent cx="5029200" cy="7113750"/>
+                  <wp:docPr id="1" name="Picture 1"/>
+                  <wp:cNvGraphicFramePr>
+                    <a:graphicFrameLocks noChangeAspect="1"/>
+                  </wp:cNvGraphicFramePr>
+                  <a:graphic>
+                    <a:graphicData uri="http://schemas.openxmlformats.org/drawingml/2006/picture">
+                      <pic:pic>
+                        <pic:nvPicPr>
+                          <pic:cNvPr id="0" name="ABORLOVE_NOLOPI_ORTHOMOSAIC.png"/>
+                          <pic:cNvPicPr/>
+                        </pic:nvPicPr>
+                        <pic:blipFill>
+                          <a:blip r:embed="rId11"/>
+                          <a:stretch>
+                            <a:fillRect/>
+                          </a:stretch>
+                        </pic:blipFill>
+                        <pic:spPr>
+                          <a:xfrm>
+                            <a:off x="0" y="0"/>
+                            <a:ext cx="5029200" cy="7113750"/>
+                          </a:xfrm>
+                          <a:prstGeom prst="rect"/>
+                        </pic:spPr>
+                      </pic:pic>
+                    </a:graphicData>
+                  </a:graphic>
+                </wp:inline>
+              </w:drawing>
+            </w:r>
+          </w:p>
+          <w:p>
+            <w:pPr>
+              <w:jc w:val="center"/>
+            </w:pPr>
+            <w:r>
+              <w:rPr>
+                <w:i/>
+                <w:color w:val="444444"/>
                 <w:sz w:val="18"/>
-                <w:szCs w:val="18"/>
-              </w:rPr>
-              <w:t xml:space="preserve">■ PLACEHOLDER — </w:t>
-            </w:r>
-            <w:r>
-              <w:rPr>
-                <w:color w:val="A06000"/>
+              </w:rPr>
+              <w:t>Figure 4.1: Aborlove Nolopi Orthomosaic (52 Ha) — April 2026. ECW master: 66 MB. CRS: WGS 84 UTM Zone 31N.</w:t>
+            </w:r>
+          </w:p>
+          <w:p>
+            <w:r>
+              <w:t xml:space="preserve"> </w:t>
+            </w:r>
+          </w:p>
+          <w:p>
+            <w:pPr>
+              <w:jc w:val="center"/>
+            </w:pPr>
+            <w:r>
+              <w:drawing>
+                <wp:inline xmlns:a="http://schemas.openxmlformats.org/drawingml/2006/main" xmlns:pic="http://schemas.openxmlformats.org/drawingml/2006/picture">
+                  <wp:extent cx="5029200" cy="7116952"/>
+                  <wp:docPr id="2" name="Picture 2"/>
+                  <wp:cNvGraphicFramePr>
+                    <a:graphicFrameLocks noChangeAspect="1"/>
+                  </wp:cNvGraphicFramePr>
+                  <a:graphic>
+                    <a:graphicData uri="http://schemas.openxmlformats.org/drawingml/2006/picture">
+                      <pic:pic>
+                        <pic:nvPicPr>
+                          <pic:cNvPr id="0" name="AGATSIVI_AGORTOE_ORTHOMOSAIC.png"/>
+                          <pic:cNvPicPr/>
+                        </pic:nvPicPr>
+                        <pic:blipFill>
+                          <a:blip r:embed="rId12"/>
+                          <a:stretch>
+                            <a:fillRect/>
+                          </a:stretch>
+                        </pic:blipFill>
+                        <pic:spPr>
+                          <a:xfrm>
+                            <a:off x="0" y="0"/>
+                            <a:ext cx="5029200" cy="7116952"/>
+                          </a:xfrm>
+                          <a:prstGeom prst="rect"/>
+                        </pic:spPr>
+                      </pic:pic>
+                    </a:graphicData>
+                  </a:graphic>
+                </wp:inline>
+              </w:drawing>
+            </w:r>
+          </w:p>
+          <w:p>
+            <w:pPr>
+              <w:jc w:val="center"/>
+            </w:pPr>
+            <w:r>
+              <w:rPr>
+                <w:i/>
+                <w:color w:val="444444"/>
                 <w:sz w:val="18"/>
-                <w:szCs w:val="18"/>
-              </w:rPr>
-              <w:t xml:space="preserve">Drone </w:t>
-            </w:r>
-            <w:proofErr w:type="spellStart"/>
-            <w:r>
-              <w:rPr>
-                <w:color w:val="A06000"/>
+              </w:rPr>
+              <w:t>Figure 4.2: Agatsivi-Agortoe Orthomosaic (762 Ha) — April 2026. ECW master: 1.92 GB. CRS: WGS 84 UTM Zone 31N.</w:t>
+            </w:r>
+          </w:p>
+          <w:p>
+            <w:r>
+              <w:t xml:space="preserve"> </w:t>
+            </w:r>
+          </w:p>
+          <w:p>
+            <w:pPr>
+              <w:jc w:val="center"/>
+            </w:pPr>
+            <w:r>
+              <w:drawing>
+                <wp:inline xmlns:a="http://schemas.openxmlformats.org/drawingml/2006/main" xmlns:pic="http://schemas.openxmlformats.org/drawingml/2006/picture">
+                  <wp:extent cx="5029200" cy="7116952"/>
+                  <wp:docPr id="3" name="Picture 3"/>
+                  <wp:cNvGraphicFramePr>
+                    <a:graphicFrameLocks noChangeAspect="1"/>
+                  </wp:cNvGraphicFramePr>
+                  <a:graphic>
+                    <a:graphicData uri="http://schemas.openxmlformats.org/drawingml/2006/picture">
+                      <pic:pic>
+                        <pic:nvPicPr>
+                          <pic:cNvPr id="0" name="SALO_AGORTOE_ORTHOMOSAIC.png"/>
+                          <pic:cNvPicPr/>
+                        </pic:nvPicPr>
+                        <pic:blipFill>
+                          <a:blip r:embed="rId13"/>
+                          <a:stretch>
+                            <a:fillRect/>
+                          </a:stretch>
+                        </pic:blipFill>
+                        <pic:spPr>
+                          <a:xfrm>
+                            <a:off x="0" y="0"/>
+                            <a:ext cx="5029200" cy="7116952"/>
+                          </a:xfrm>
+                          <a:prstGeom prst="rect"/>
+                        </pic:spPr>
+                      </pic:pic>
+                    </a:graphicData>
+                  </a:graphic>
+                </wp:inline>
+              </w:drawing>
+            </w:r>
+          </w:p>
+          <w:p>
+            <w:pPr>
+              <w:jc w:val="center"/>
+            </w:pPr>
+            <w:r>
+              <w:rPr>
+                <w:i/>
+                <w:color w:val="444444"/>
                 <w:sz w:val="18"/>
-                <w:szCs w:val="18"/>
-              </w:rPr>
-              <w:t>orthomosaic</w:t>
-            </w:r>
-            <w:proofErr w:type="spellEnd"/>
-            <w:r>
-              <w:rPr>
-                <w:color w:val="A06000"/>
+              </w:rPr>
+              <w:t>Figure 4.3: Salo-Agortoe Stretch Orthomosaic (525 Ha) — April 2026. ECW master: 1.83 GB. CRS: WGS 84 UTM Zone 31N.</w:t>
+            </w:r>
+          </w:p>
+          <w:p>
+            <w:r>
+              <w:t xml:space="preserve"> </w:t>
+            </w:r>
+          </w:p>
+          <w:p>
+            <w:pPr>
+              <w:jc w:val="center"/>
+            </w:pPr>
+            <w:r>
+              <w:drawing>
+                <wp:inline xmlns:a="http://schemas.openxmlformats.org/drawingml/2006/main" xmlns:pic="http://schemas.openxmlformats.org/drawingml/2006/picture">
+                  <wp:extent cx="5029200" cy="7116952"/>
+                  <wp:docPr id="4" name="Picture 4"/>
+                  <wp:cNvGraphicFramePr>
+                    <a:graphicFrameLocks noChangeAspect="1"/>
+                  </wp:cNvGraphicFramePr>
+                  <a:graphic>
+                    <a:graphicData uri="http://schemas.openxmlformats.org/drawingml/2006/picture">
+                      <pic:pic>
+                        <pic:nvPicPr>
+                          <pic:cNvPr id="0" name="ANYANUI_COMBINE_ORTHOMOSAIC.png"/>
+                          <pic:cNvPicPr/>
+                        </pic:nvPicPr>
+                        <pic:blipFill>
+                          <a:blip r:embed="rId14"/>
+                          <a:stretch>
+                            <a:fillRect/>
+                          </a:stretch>
+                        </pic:blipFill>
+                        <pic:spPr>
+                          <a:xfrm>
+                            <a:off x="0" y="0"/>
+                            <a:ext cx="5029200" cy="7116952"/>
+                          </a:xfrm>
+                          <a:prstGeom prst="rect"/>
+                        </pic:spPr>
+                      </pic:pic>
+                    </a:graphicData>
+                  </a:graphic>
+                </wp:inline>
+              </w:drawing>
+            </w:r>
+          </w:p>
+          <w:p>
+            <w:pPr>
+              <w:jc w:val="center"/>
+            </w:pPr>
+            <w:r>
+              <w:rPr>
+                <w:i/>
+                <w:color w:val="444444"/>
                 <w:sz w:val="18"/>
-                <w:szCs w:val="18"/>
-              </w:rPr>
-              <w:t xml:space="preserve"> collage(s) for all four </w:t>
-            </w:r>
-            <w:proofErr w:type="spellStart"/>
-            <w:r>
-              <w:rPr>
-                <w:color w:val="A06000"/>
-                <w:sz w:val="18"/>
-                <w:szCs w:val="18"/>
-              </w:rPr>
-              <w:t>AoIs</w:t>
-            </w:r>
-            <w:proofErr w:type="spellEnd"/>
-            <w:r>
-              <w:rPr>
-                <w:color w:val="A06000"/>
-                <w:sz w:val="18"/>
-                <w:szCs w:val="18"/>
-              </w:rPr>
-              <w:t xml:space="preserve"> — insert when approved for publication</w:t>
+              </w:rPr>
+              <w:t>Figure 4.4: Anyanui Combine Orthomosaic (128 Ha) — April 2026. ECW master: 654 MB. CRS: WGS 84 UTM Zone 31N.</w:t>
             </w:r>
           </w:p>
         </w:tc>
@@ -6197,15 +6364,12 @@
           </w:tcPr>
           <w:p>
             <w:r>
-              <w:t xml:space="preserve">Drone </w:t>
-            </w:r>
-            <w:proofErr w:type="spellStart"/>
-            <w:r>
-              <w:t>orthomosaic</w:t>
-            </w:r>
-            <w:proofErr w:type="spellEnd"/>
-            <w:r>
-              <w:t xml:space="preserve"> collage</w:t>
+              <w:rPr>
+                <w:b/>
+                <w:color w:val="1A7348"/>
+                <w:sz w:val="20"/>
+              </w:rPr>
+              <w:t>✓ FILLED — Drone orthomosaic collage</w:t>
             </w:r>
           </w:p>
         </w:tc>

</xml_diff>